<commit_message>
edited cv - may 2026
</commit_message>
<xml_diff>
--- a/Ava_Ma_deSousa_CV.docx
+++ b/Ava_Ma_deSousa_CV.docx
@@ -388,16 +388,6 @@
               </w:rPr>
               <w:t>PhD in Social Psychology</w:t>
             </w:r>
-            <w:r>
-              <w:rPr>
-                <w:rFonts w:eastAsia="SimSun" w:cs="Times New Roman"/>
-                <w:bCs/>
-                <w:sz w:val="23"/>
-                <w:szCs w:val="23"/>
-                <w:lang w:val="en-CA"/>
-              </w:rPr>
-              <w:t>, GPA: 4.00/4.00</w:t>
-            </w:r>
           </w:p>
           <w:p>
             <w:pPr>
@@ -559,17 +549,29 @@
                 <w:szCs w:val="23"/>
                 <w:lang w:val="en-CA"/>
               </w:rPr>
-              <w:t xml:space="preserve">Research MSc in Brain and Cognitive Sciences, </w:t>
+              <w:t>Research MSc in Brain and Cognitive Sciences</w:t>
+            </w:r>
+            <w:r>
+              <w:rPr>
+                <w:rFonts w:eastAsia="SimSun" w:cs="Times New Roman"/>
+                <w:b/>
+                <w:sz w:val="23"/>
+                <w:szCs w:val="23"/>
+                <w:lang w:val="en-CA"/>
+              </w:rPr>
+              <w:t xml:space="preserve">, </w:t>
             </w:r>
             <w:r>
               <w:rPr>
                 <w:rFonts w:eastAsia="SimSun" w:cs="Times New Roman"/>
                 <w:bCs/>
+                <w:i/>
+                <w:iCs/>
                 <w:sz w:val="23"/>
                 <w:szCs w:val="23"/>
                 <w:lang w:val="en-CA"/>
               </w:rPr>
-              <w:t>GPA: 8.83/10.0</w:t>
+              <w:t>cum laude</w:t>
             </w:r>
           </w:p>
         </w:tc>
@@ -965,7 +967,6 @@
                 <w:szCs w:val="23"/>
               </w:rPr>
             </w:pPr>
-            <w:proofErr w:type="spellStart"/>
             <w:r>
               <w:rPr>
                 <w:rFonts w:eastAsia="SimSun" w:cs="Times New Roman"/>
@@ -973,9 +974,17 @@
                 <w:sz w:val="23"/>
                 <w:szCs w:val="23"/>
               </w:rPr>
-              <w:t>Honours</w:t>
-            </w:r>
-            <w:proofErr w:type="spellEnd"/>
+              <w:t>BSc in Cognitive Sciences &amp; Psychology</w:t>
+            </w:r>
+            <w:r>
+              <w:rPr>
+                <w:rFonts w:eastAsia="SimSun" w:cs="Times New Roman"/>
+                <w:bCs/>
+                <w:sz w:val="23"/>
+                <w:szCs w:val="23"/>
+              </w:rPr>
+              <w:t>,</w:t>
+            </w:r>
             <w:r>
               <w:rPr>
                 <w:rFonts w:eastAsia="SimSun" w:cs="Times New Roman"/>
@@ -983,7 +992,7 @@
                 <w:sz w:val="23"/>
                 <w:szCs w:val="23"/>
               </w:rPr>
-              <w:t xml:space="preserve"> BSc in Cognitive Sciences &amp; Psychology, </w:t>
+              <w:t xml:space="preserve"> </w:t>
             </w:r>
             <w:r>
               <w:rPr>
@@ -992,7 +1001,25 @@
                 <w:sz w:val="23"/>
                 <w:szCs w:val="23"/>
               </w:rPr>
-              <w:t xml:space="preserve">GPA: 3.93/4.00 </w:t>
+              <w:t xml:space="preserve">with </w:t>
+            </w:r>
+            <w:r>
+              <w:rPr>
+                <w:rFonts w:eastAsia="SimSun" w:cs="Times New Roman"/>
+                <w:bCs/>
+                <w:sz w:val="23"/>
+                <w:szCs w:val="23"/>
+              </w:rPr>
+              <w:t>high distinction</w:t>
+            </w:r>
+            <w:r>
+              <w:rPr>
+                <w:rFonts w:eastAsia="SimSun" w:cs="Times New Roman"/>
+                <w:bCs/>
+                <w:sz w:val="23"/>
+                <w:szCs w:val="23"/>
+              </w:rPr>
+              <w:t xml:space="preserve"> </w:t>
             </w:r>
           </w:p>
         </w:tc>
@@ -1356,63 +1383,23 @@
                 <w:sz w:val="23"/>
                 <w:szCs w:val="23"/>
               </w:rPr>
-              <w:t xml:space="preserve">Social </w:t>
-            </w:r>
-            <w:r>
-              <w:rPr>
-                <w:rFonts w:eastAsia="SimSun" w:cs="Times New Roman"/>
-                <w:sz w:val="23"/>
-                <w:szCs w:val="23"/>
-              </w:rPr>
-              <w:t xml:space="preserve">Sciences </w:t>
-            </w:r>
-            <w:r>
-              <w:rPr>
-                <w:rFonts w:eastAsia="SimSun" w:cs="Times New Roman"/>
-                <w:sz w:val="23"/>
-                <w:szCs w:val="23"/>
-              </w:rPr>
-              <w:t>&amp;</w:t>
-            </w:r>
-            <w:r>
-              <w:rPr>
-                <w:rFonts w:eastAsia="SimSun" w:cs="Times New Roman"/>
-                <w:sz w:val="23"/>
-                <w:szCs w:val="23"/>
-              </w:rPr>
-              <w:t xml:space="preserve"> Humanities Research Council Doctoral Fellowship (</w:t>
-            </w:r>
-            <w:r>
-              <w:rPr>
-                <w:rFonts w:eastAsia="SimSun" w:cs="Times New Roman"/>
-                <w:sz w:val="23"/>
-                <w:szCs w:val="23"/>
-              </w:rPr>
-              <w:t>12</w:t>
-            </w:r>
-            <w:r>
-              <w:rPr>
-                <w:rFonts w:eastAsia="SimSun" w:cs="Times New Roman"/>
-                <w:sz w:val="23"/>
-                <w:szCs w:val="23"/>
-              </w:rPr>
-              <w:t>0,</w:t>
-            </w:r>
-            <w:r>
-              <w:rPr>
-                <w:rFonts w:eastAsia="SimSun" w:cs="Times New Roman"/>
-                <w:sz w:val="23"/>
-                <w:szCs w:val="23"/>
-              </w:rPr>
-              <w:t>000 CAD</w:t>
-            </w:r>
-            <w:r>
-              <w:rPr>
-                <w:rFonts w:eastAsia="SimSun" w:cs="Times New Roman"/>
-                <w:sz w:val="23"/>
-                <w:szCs w:val="23"/>
-              </w:rPr>
-              <w:t>)</w:t>
+              <w:t xml:space="preserve">UCSB </w:t>
+            </w:r>
+            <w:r>
+              <w:rPr>
+                <w:rFonts w:eastAsia="SimSun" w:cs="Times New Roman"/>
+                <w:sz w:val="23"/>
+                <w:szCs w:val="23"/>
+              </w:rPr>
+              <w:t>Graduate Division Dissertation Fellowship</w:t>
+            </w:r>
+            <w:r>
+              <w:rPr>
+                <w:rFonts w:eastAsia="SimSun" w:cs="Times New Roman"/>
+                <w:sz w:val="23"/>
+                <w:szCs w:val="23"/>
+              </w:rPr>
+              <w:t xml:space="preserve"> (10,800 USD)</w:t>
             </w:r>
           </w:p>
           <w:p>
@@ -1447,23 +1434,63 @@
                 <w:sz w:val="23"/>
                 <w:szCs w:val="23"/>
               </w:rPr>
-              <w:t xml:space="preserve">UCSB </w:t>
-            </w:r>
-            <w:r>
-              <w:rPr>
-                <w:rFonts w:eastAsia="SimSun" w:cs="Times New Roman"/>
-                <w:sz w:val="23"/>
-                <w:szCs w:val="23"/>
-              </w:rPr>
-              <w:t>Graduate Division Dissertation Fellowship</w:t>
-            </w:r>
-            <w:r>
-              <w:rPr>
-                <w:rFonts w:eastAsia="SimSun" w:cs="Times New Roman"/>
-                <w:sz w:val="23"/>
-                <w:szCs w:val="23"/>
-              </w:rPr>
-              <w:t xml:space="preserve"> (10,800 USD)</w:t>
+              <w:t xml:space="preserve">Social </w:t>
+            </w:r>
+            <w:r>
+              <w:rPr>
+                <w:rFonts w:eastAsia="SimSun" w:cs="Times New Roman"/>
+                <w:sz w:val="23"/>
+                <w:szCs w:val="23"/>
+              </w:rPr>
+              <w:t xml:space="preserve">Sciences </w:t>
+            </w:r>
+            <w:r>
+              <w:rPr>
+                <w:rFonts w:eastAsia="SimSun" w:cs="Times New Roman"/>
+                <w:sz w:val="23"/>
+                <w:szCs w:val="23"/>
+              </w:rPr>
+              <w:t>&amp;</w:t>
+            </w:r>
+            <w:r>
+              <w:rPr>
+                <w:rFonts w:eastAsia="SimSun" w:cs="Times New Roman"/>
+                <w:sz w:val="23"/>
+                <w:szCs w:val="23"/>
+              </w:rPr>
+              <w:t xml:space="preserve"> Humanities Research Council Doctoral Fellowship (</w:t>
+            </w:r>
+            <w:r>
+              <w:rPr>
+                <w:rFonts w:eastAsia="SimSun" w:cs="Times New Roman"/>
+                <w:sz w:val="23"/>
+                <w:szCs w:val="23"/>
+              </w:rPr>
+              <w:t>12</w:t>
+            </w:r>
+            <w:r>
+              <w:rPr>
+                <w:rFonts w:eastAsia="SimSun" w:cs="Times New Roman"/>
+                <w:sz w:val="23"/>
+                <w:szCs w:val="23"/>
+              </w:rPr>
+              <w:t>0,</w:t>
+            </w:r>
+            <w:r>
+              <w:rPr>
+                <w:rFonts w:eastAsia="SimSun" w:cs="Times New Roman"/>
+                <w:sz w:val="23"/>
+                <w:szCs w:val="23"/>
+              </w:rPr>
+              <w:t>000 CAD</w:t>
+            </w:r>
+            <w:r>
+              <w:rPr>
+                <w:rFonts w:eastAsia="SimSun" w:cs="Times New Roman"/>
+                <w:sz w:val="23"/>
+                <w:szCs w:val="23"/>
+              </w:rPr>
+              <w:t>)</w:t>
             </w:r>
           </w:p>
           <w:p>
@@ -1865,22 +1892,6 @@
                 <w:sz w:val="23"/>
                 <w:szCs w:val="23"/>
               </w:rPr>
-              <w:t>2</w:t>
-            </w:r>
-            <w:r>
-              <w:rPr>
-                <w:rFonts w:eastAsia="SimSun" w:cs="Times New Roman"/>
-                <w:sz w:val="23"/>
-                <w:szCs w:val="23"/>
-              </w:rPr>
-              <w:t>-202</w:t>
-            </w:r>
-            <w:r>
-              <w:rPr>
-                <w:rFonts w:eastAsia="SimSun" w:cs="Times New Roman"/>
-                <w:sz w:val="23"/>
-                <w:szCs w:val="23"/>
-              </w:rPr>
               <w:t>6</w:t>
             </w:r>
           </w:p>
@@ -1917,7 +1928,15 @@
                 <w:sz w:val="23"/>
                 <w:szCs w:val="23"/>
               </w:rPr>
-              <w:t>2026</w:t>
+              <w:t>202</w:t>
+            </w:r>
+            <w:r>
+              <w:rPr>
+                <w:rFonts w:eastAsia="SimSun" w:cs="Times New Roman"/>
+                <w:sz w:val="23"/>
+                <w:szCs w:val="23"/>
+              </w:rPr>
+              <w:t>2-2026</w:t>
             </w:r>
           </w:p>
           <w:p>

</xml_diff>